<commit_message>
Updated the images in screenshot file
</commit_message>
<xml_diff>
--- a/Screenshots.docx
+++ b/Screenshots.docx
@@ -3,6 +3,424 @@
 <w:document xmlns:wpc="http://schemas.microsoft.com/office/word/2010/wordprocessingCanvas" xmlns:cx="http://schemas.microsoft.com/office/drawing/2014/chartex" xmlns:cx1="http://schemas.microsoft.com/office/drawing/2015/9/8/chartex" xmlns:mc="http://schemas.openxmlformats.org/markup-compatibility/2006" xmlns:o="urn:schemas-microsoft-com:office:office" xmlns:r="http://schemas.openxmlformats.org/officeDocument/2006/relationships" xmlns:m="http://schemas.openxmlformats.org/officeDocument/2006/math" xmlns:v="urn:schemas-microsoft-com:vml" xmlns:wp14="http://schemas.microsoft.com/office/word/2010/wordprocessingDrawing" xmlns:wp="http://schemas.openxmlformats.org/drawingml/2006/wordprocessingDrawing" xmlns:w10="urn:schemas-microsoft-com:office:word" xmlns:w="http://schemas.openxmlformats.org/wordprocessingml/2006/main" xmlns:w14="http://schemas.microsoft.com/office/word/2010/wordml" xmlns:w15="http://schemas.microsoft.com/office/word/2012/wordml" xmlns:w16se="http://schemas.microsoft.com/office/word/2015/wordml/symex" xmlns:wpg="http://schemas.microsoft.com/office/word/2010/wordprocessingGroup" xmlns:wpi="http://schemas.microsoft.com/office/word/2010/wordprocessingInk" xmlns:wne="http://schemas.microsoft.com/office/word/2006/wordml" xmlns:wps="http://schemas.microsoft.com/office/word/2010/wordprocessingShape" mc:Ignorable="w14 w15 w16se wp14">
   <w:body>
     <w:p>
+      <w:proofErr w:type="spellStart"/>
+      <w:r>
+        <w:t>Git</w:t>
+      </w:r>
+      <w:proofErr w:type="spellEnd"/>
+      <w:r>
+        <w:t xml:space="preserve"> setup</w:t>
+      </w:r>
+    </w:p>
+    <w:p>
+      <w:r>
+        <w:drawing>
+          <wp:inline distT="0" distB="0" distL="0" distR="0" wp14:anchorId="3293AC42" wp14:editId="3882A7DA">
+            <wp:extent cx="5943600" cy="3235960"/>
+            <wp:effectExtent l="0" t="0" r="0" b="2540"/>
+            <wp:docPr id="11" name="Picture 11"/>
+            <wp:cNvGraphicFramePr>
+              <a:graphicFrameLocks xmlns:a="http://schemas.openxmlformats.org/drawingml/2006/main" noChangeAspect="1"/>
+            </wp:cNvGraphicFramePr>
+            <a:graphic xmlns:a="http://schemas.openxmlformats.org/drawingml/2006/main">
+              <a:graphicData uri="http://schemas.openxmlformats.org/drawingml/2006/picture">
+                <pic:pic xmlns:pic="http://schemas.openxmlformats.org/drawingml/2006/picture">
+                  <pic:nvPicPr>
+                    <pic:cNvPr id="1" name=""/>
+                    <pic:cNvPicPr/>
+                  </pic:nvPicPr>
+                  <pic:blipFill>
+                    <a:blip r:embed="rId4"/>
+                    <a:stretch>
+                      <a:fillRect/>
+                    </a:stretch>
+                  </pic:blipFill>
+                  <pic:spPr>
+                    <a:xfrm>
+                      <a:off x="0" y="0"/>
+                      <a:ext cx="5943600" cy="3235960"/>
+                    </a:xfrm>
+                    <a:prstGeom prst="rect">
+                      <a:avLst/>
+                    </a:prstGeom>
+                  </pic:spPr>
+                </pic:pic>
+              </a:graphicData>
+            </a:graphic>
+          </wp:inline>
+        </w:drawing>
+      </w:r>
+    </w:p>
+    <w:p/>
+    <w:p>
+      <w:r>
+        <w:drawing>
+          <wp:inline distT="0" distB="0" distL="0" distR="0" wp14:anchorId="3681C59F" wp14:editId="5C6C16B7">
+            <wp:extent cx="5687219" cy="1733792"/>
+            <wp:effectExtent l="0" t="0" r="8890" b="0"/>
+            <wp:docPr id="12" name="Picture 12"/>
+            <wp:cNvGraphicFramePr>
+              <a:graphicFrameLocks xmlns:a="http://schemas.openxmlformats.org/drawingml/2006/main" noChangeAspect="1"/>
+            </wp:cNvGraphicFramePr>
+            <a:graphic xmlns:a="http://schemas.openxmlformats.org/drawingml/2006/main">
+              <a:graphicData uri="http://schemas.openxmlformats.org/drawingml/2006/picture">
+                <pic:pic xmlns:pic="http://schemas.openxmlformats.org/drawingml/2006/picture">
+                  <pic:nvPicPr>
+                    <pic:cNvPr id="1" name=""/>
+                    <pic:cNvPicPr/>
+                  </pic:nvPicPr>
+                  <pic:blipFill>
+                    <a:blip r:embed="rId5"/>
+                    <a:stretch>
+                      <a:fillRect/>
+                    </a:stretch>
+                  </pic:blipFill>
+                  <pic:spPr>
+                    <a:xfrm>
+                      <a:off x="0" y="0"/>
+                      <a:ext cx="5687219" cy="1733792"/>
+                    </a:xfrm>
+                    <a:prstGeom prst="rect">
+                      <a:avLst/>
+                    </a:prstGeom>
+                  </pic:spPr>
+                </pic:pic>
+              </a:graphicData>
+            </a:graphic>
+          </wp:inline>
+        </w:drawing>
+      </w:r>
+    </w:p>
+    <w:p>
+      <w:r>
+        <w:drawing>
+          <wp:inline distT="0" distB="0" distL="0" distR="0" wp14:anchorId="489D71A6" wp14:editId="78B679EF">
+            <wp:extent cx="5458587" cy="2010056"/>
+            <wp:effectExtent l="0" t="0" r="0" b="9525"/>
+            <wp:docPr id="10" name="Picture 10"/>
+            <wp:cNvGraphicFramePr>
+              <a:graphicFrameLocks xmlns:a="http://schemas.openxmlformats.org/drawingml/2006/main" noChangeAspect="1"/>
+            </wp:cNvGraphicFramePr>
+            <a:graphic xmlns:a="http://schemas.openxmlformats.org/drawingml/2006/main">
+              <a:graphicData uri="http://schemas.openxmlformats.org/drawingml/2006/picture">
+                <pic:pic xmlns:pic="http://schemas.openxmlformats.org/drawingml/2006/picture">
+                  <pic:nvPicPr>
+                    <pic:cNvPr id="1" name=""/>
+                    <pic:cNvPicPr/>
+                  </pic:nvPicPr>
+                  <pic:blipFill>
+                    <a:blip r:embed="rId6"/>
+                    <a:stretch>
+                      <a:fillRect/>
+                    </a:stretch>
+                  </pic:blipFill>
+                  <pic:spPr>
+                    <a:xfrm>
+                      <a:off x="0" y="0"/>
+                      <a:ext cx="5458587" cy="2010056"/>
+                    </a:xfrm>
+                    <a:prstGeom prst="rect">
+                      <a:avLst/>
+                    </a:prstGeom>
+                  </pic:spPr>
+                </pic:pic>
+              </a:graphicData>
+            </a:graphic>
+          </wp:inline>
+        </w:drawing>
+      </w:r>
+    </w:p>
+    <w:p/>
+    <w:p>
+      <w:r>
+        <w:lastRenderedPageBreak/>
+        <w:drawing>
+          <wp:inline distT="0" distB="0" distL="0" distR="0" wp14:anchorId="71B87245" wp14:editId="35C6D981">
+            <wp:extent cx="4363059" cy="5630061"/>
+            <wp:effectExtent l="0" t="0" r="0" b="8890"/>
+            <wp:docPr id="13" name="Picture 13"/>
+            <wp:cNvGraphicFramePr>
+              <a:graphicFrameLocks xmlns:a="http://schemas.openxmlformats.org/drawingml/2006/main" noChangeAspect="1"/>
+            </wp:cNvGraphicFramePr>
+            <a:graphic xmlns:a="http://schemas.openxmlformats.org/drawingml/2006/main">
+              <a:graphicData uri="http://schemas.openxmlformats.org/drawingml/2006/picture">
+                <pic:pic xmlns:pic="http://schemas.openxmlformats.org/drawingml/2006/picture">
+                  <pic:nvPicPr>
+                    <pic:cNvPr id="1" name=""/>
+                    <pic:cNvPicPr/>
+                  </pic:nvPicPr>
+                  <pic:blipFill>
+                    <a:blip r:embed="rId7"/>
+                    <a:stretch>
+                      <a:fillRect/>
+                    </a:stretch>
+                  </pic:blipFill>
+                  <pic:spPr>
+                    <a:xfrm>
+                      <a:off x="0" y="0"/>
+                      <a:ext cx="4363059" cy="5630061"/>
+                    </a:xfrm>
+                    <a:prstGeom prst="rect">
+                      <a:avLst/>
+                    </a:prstGeom>
+                  </pic:spPr>
+                </pic:pic>
+              </a:graphicData>
+            </a:graphic>
+          </wp:inline>
+        </w:drawing>
+      </w:r>
+    </w:p>
+    <w:p/>
+    <w:p>
+      <w:r>
+        <w:lastRenderedPageBreak/>
+        <w:drawing>
+          <wp:inline distT="0" distB="0" distL="0" distR="0" wp14:anchorId="5C698CDC" wp14:editId="18698B7F">
+            <wp:extent cx="5943600" cy="2788920"/>
+            <wp:effectExtent l="0" t="0" r="0" b="0"/>
+            <wp:docPr id="14" name="Picture 14"/>
+            <wp:cNvGraphicFramePr>
+              <a:graphicFrameLocks xmlns:a="http://schemas.openxmlformats.org/drawingml/2006/main" noChangeAspect="1"/>
+            </wp:cNvGraphicFramePr>
+            <a:graphic xmlns:a="http://schemas.openxmlformats.org/drawingml/2006/main">
+              <a:graphicData uri="http://schemas.openxmlformats.org/drawingml/2006/picture">
+                <pic:pic xmlns:pic="http://schemas.openxmlformats.org/drawingml/2006/picture">
+                  <pic:nvPicPr>
+                    <pic:cNvPr id="1" name=""/>
+                    <pic:cNvPicPr/>
+                  </pic:nvPicPr>
+                  <pic:blipFill>
+                    <a:blip r:embed="rId8"/>
+                    <a:stretch>
+                      <a:fillRect/>
+                    </a:stretch>
+                  </pic:blipFill>
+                  <pic:spPr>
+                    <a:xfrm>
+                      <a:off x="0" y="0"/>
+                      <a:ext cx="5943600" cy="2788920"/>
+                    </a:xfrm>
+                    <a:prstGeom prst="rect">
+                      <a:avLst/>
+                    </a:prstGeom>
+                  </pic:spPr>
+                </pic:pic>
+              </a:graphicData>
+            </a:graphic>
+          </wp:inline>
+        </w:drawing>
+      </w:r>
+    </w:p>
+    <w:p/>
+    <w:p>
+      <w:r>
+        <w:lastRenderedPageBreak/>
+        <w:drawing>
+          <wp:inline distT="0" distB="0" distL="0" distR="0" wp14:anchorId="639560AD" wp14:editId="70C88F19">
+            <wp:extent cx="5096586" cy="5410955"/>
+            <wp:effectExtent l="0" t="0" r="8890" b="0"/>
+            <wp:docPr id="15" name="Picture 15"/>
+            <wp:cNvGraphicFramePr>
+              <a:graphicFrameLocks xmlns:a="http://schemas.openxmlformats.org/drawingml/2006/main" noChangeAspect="1"/>
+            </wp:cNvGraphicFramePr>
+            <a:graphic xmlns:a="http://schemas.openxmlformats.org/drawingml/2006/main">
+              <a:graphicData uri="http://schemas.openxmlformats.org/drawingml/2006/picture">
+                <pic:pic xmlns:pic="http://schemas.openxmlformats.org/drawingml/2006/picture">
+                  <pic:nvPicPr>
+                    <pic:cNvPr id="1" name=""/>
+                    <pic:cNvPicPr/>
+                  </pic:nvPicPr>
+                  <pic:blipFill>
+                    <a:blip r:embed="rId9"/>
+                    <a:stretch>
+                      <a:fillRect/>
+                    </a:stretch>
+                  </pic:blipFill>
+                  <pic:spPr>
+                    <a:xfrm>
+                      <a:off x="0" y="0"/>
+                      <a:ext cx="5096586" cy="5410955"/>
+                    </a:xfrm>
+                    <a:prstGeom prst="rect">
+                      <a:avLst/>
+                    </a:prstGeom>
+                  </pic:spPr>
+                </pic:pic>
+              </a:graphicData>
+            </a:graphic>
+          </wp:inline>
+        </w:drawing>
+      </w:r>
+    </w:p>
+    <w:p/>
+    <w:p>
+      <w:r>
+        <w:lastRenderedPageBreak/>
+        <w:drawing>
+          <wp:inline distT="0" distB="0" distL="0" distR="0" wp14:anchorId="5349E7D7" wp14:editId="67A5FE14">
+            <wp:extent cx="5943600" cy="3597275"/>
+            <wp:effectExtent l="0" t="0" r="0" b="3175"/>
+            <wp:docPr id="16" name="Picture 16"/>
+            <wp:cNvGraphicFramePr>
+              <a:graphicFrameLocks xmlns:a="http://schemas.openxmlformats.org/drawingml/2006/main" noChangeAspect="1"/>
+            </wp:cNvGraphicFramePr>
+            <a:graphic xmlns:a="http://schemas.openxmlformats.org/drawingml/2006/main">
+              <a:graphicData uri="http://schemas.openxmlformats.org/drawingml/2006/picture">
+                <pic:pic xmlns:pic="http://schemas.openxmlformats.org/drawingml/2006/picture">
+                  <pic:nvPicPr>
+                    <pic:cNvPr id="1" name=""/>
+                    <pic:cNvPicPr/>
+                  </pic:nvPicPr>
+                  <pic:blipFill>
+                    <a:blip r:embed="rId10"/>
+                    <a:stretch>
+                      <a:fillRect/>
+                    </a:stretch>
+                  </pic:blipFill>
+                  <pic:spPr>
+                    <a:xfrm>
+                      <a:off x="0" y="0"/>
+                      <a:ext cx="5943600" cy="3597275"/>
+                    </a:xfrm>
+                    <a:prstGeom prst="rect">
+                      <a:avLst/>
+                    </a:prstGeom>
+                  </pic:spPr>
+                </pic:pic>
+              </a:graphicData>
+            </a:graphic>
+          </wp:inline>
+        </w:drawing>
+      </w:r>
+    </w:p>
+    <w:p/>
+    <w:p>
+      <w:r>
+        <w:drawing>
+          <wp:inline distT="0" distB="0" distL="0" distR="0" wp14:anchorId="7F775474" wp14:editId="4E76518B">
+            <wp:extent cx="4248743" cy="3562847"/>
+            <wp:effectExtent l="0" t="0" r="0" b="0"/>
+            <wp:docPr id="17" name="Picture 17"/>
+            <wp:cNvGraphicFramePr>
+              <a:graphicFrameLocks xmlns:a="http://schemas.openxmlformats.org/drawingml/2006/main" noChangeAspect="1"/>
+            </wp:cNvGraphicFramePr>
+            <a:graphic xmlns:a="http://schemas.openxmlformats.org/drawingml/2006/main">
+              <a:graphicData uri="http://schemas.openxmlformats.org/drawingml/2006/picture">
+                <pic:pic xmlns:pic="http://schemas.openxmlformats.org/drawingml/2006/picture">
+                  <pic:nvPicPr>
+                    <pic:cNvPr id="1" name=""/>
+                    <pic:cNvPicPr/>
+                  </pic:nvPicPr>
+                  <pic:blipFill>
+                    <a:blip r:embed="rId11"/>
+                    <a:stretch>
+                      <a:fillRect/>
+                    </a:stretch>
+                  </pic:blipFill>
+                  <pic:spPr>
+                    <a:xfrm>
+                      <a:off x="0" y="0"/>
+                      <a:ext cx="4248743" cy="3562847"/>
+                    </a:xfrm>
+                    <a:prstGeom prst="rect">
+                      <a:avLst/>
+                    </a:prstGeom>
+                  </pic:spPr>
+                </pic:pic>
+              </a:graphicData>
+            </a:graphic>
+          </wp:inline>
+        </w:drawing>
+      </w:r>
+    </w:p>
+    <w:p/>
+    <w:p>
+      <w:r>
+        <w:lastRenderedPageBreak/>
+        <w:drawing>
+          <wp:inline distT="0" distB="0" distL="0" distR="0" wp14:anchorId="406C4CA1" wp14:editId="6A45F261">
+            <wp:extent cx="4810796" cy="5820587"/>
+            <wp:effectExtent l="0" t="0" r="8890" b="8890"/>
+            <wp:docPr id="18" name="Picture 18"/>
+            <wp:cNvGraphicFramePr>
+              <a:graphicFrameLocks xmlns:a="http://schemas.openxmlformats.org/drawingml/2006/main" noChangeAspect="1"/>
+            </wp:cNvGraphicFramePr>
+            <a:graphic xmlns:a="http://schemas.openxmlformats.org/drawingml/2006/main">
+              <a:graphicData uri="http://schemas.openxmlformats.org/drawingml/2006/picture">
+                <pic:pic xmlns:pic="http://schemas.openxmlformats.org/drawingml/2006/picture">
+                  <pic:nvPicPr>
+                    <pic:cNvPr id="1" name=""/>
+                    <pic:cNvPicPr/>
+                  </pic:nvPicPr>
+                  <pic:blipFill>
+                    <a:blip r:embed="rId12"/>
+                    <a:stretch>
+                      <a:fillRect/>
+                    </a:stretch>
+                  </pic:blipFill>
+                  <pic:spPr>
+                    <a:xfrm>
+                      <a:off x="0" y="0"/>
+                      <a:ext cx="4810796" cy="5820587"/>
+                    </a:xfrm>
+                    <a:prstGeom prst="rect">
+                      <a:avLst/>
+                    </a:prstGeom>
+                  </pic:spPr>
+                </pic:pic>
+              </a:graphicData>
+            </a:graphic>
+          </wp:inline>
+        </w:drawing>
+      </w:r>
+    </w:p>
+    <w:p/>
+    <w:p>
+      <w:r>
+        <w:lastRenderedPageBreak/>
+        <w:drawing>
+          <wp:inline distT="0" distB="0" distL="0" distR="0" wp14:anchorId="77F65354" wp14:editId="228AD877">
+            <wp:extent cx="5943600" cy="3320415"/>
+            <wp:effectExtent l="0" t="0" r="0" b="0"/>
+            <wp:docPr id="19" name="Picture 19"/>
+            <wp:cNvGraphicFramePr>
+              <a:graphicFrameLocks xmlns:a="http://schemas.openxmlformats.org/drawingml/2006/main" noChangeAspect="1"/>
+            </wp:cNvGraphicFramePr>
+            <a:graphic xmlns:a="http://schemas.openxmlformats.org/drawingml/2006/main">
+              <a:graphicData uri="http://schemas.openxmlformats.org/drawingml/2006/picture">
+                <pic:pic xmlns:pic="http://schemas.openxmlformats.org/drawingml/2006/picture">
+                  <pic:nvPicPr>
+                    <pic:cNvPr id="1" name=""/>
+                    <pic:cNvPicPr/>
+                  </pic:nvPicPr>
+                  <pic:blipFill>
+                    <a:blip r:embed="rId13"/>
+                    <a:stretch>
+                      <a:fillRect/>
+                    </a:stretch>
+                  </pic:blipFill>
+                  <pic:spPr>
+                    <a:xfrm>
+                      <a:off x="0" y="0"/>
+                      <a:ext cx="5943600" cy="3320415"/>
+                    </a:xfrm>
+                    <a:prstGeom prst="rect">
+                      <a:avLst/>
+                    </a:prstGeom>
+                  </pic:spPr>
+                </pic:pic>
+              </a:graphicData>
+            </a:graphic>
+          </wp:inline>
+        </w:drawing>
+      </w:r>
+      <w:bookmarkStart w:id="0" w:name="_GoBack"/>
+      <w:bookmarkEnd w:id="0"/>
+    </w:p>
+    <w:p/>
+    <w:p/>
+    <w:p>
       <w:r>
         <w:t>Task 1.</w:t>
       </w:r>
@@ -14,6 +432,7 @@
     </w:p>
     <w:p>
       <w:r>
+        <w:lastRenderedPageBreak/>
         <w:drawing>
           <wp:inline distT="0" distB="0" distL="0" distR="0" wp14:anchorId="0A31E81E" wp14:editId="37A287DD">
             <wp:extent cx="5943600" cy="4758690"/>
@@ -30,7 +449,7 @@
                     <pic:cNvPicPr/>
                   </pic:nvPicPr>
                   <pic:blipFill>
-                    <a:blip r:embed="rId4"/>
+                    <a:blip r:embed="rId14"/>
                     <a:stretch>
                       <a:fillRect/>
                     </a:stretch>
@@ -76,7 +495,7 @@
                     <pic:cNvPicPr/>
                   </pic:nvPicPr>
                   <pic:blipFill>
-                    <a:blip r:embed="rId5"/>
+                    <a:blip r:embed="rId15"/>
                     <a:stretch>
                       <a:fillRect/>
                     </a:stretch>
@@ -125,7 +544,7 @@
                     <pic:cNvPicPr/>
                   </pic:nvPicPr>
                   <pic:blipFill>
-                    <a:blip r:embed="rId6"/>
+                    <a:blip r:embed="rId16"/>
                     <a:stretch>
                       <a:fillRect/>
                     </a:stretch>
@@ -171,7 +590,7 @@
                     <pic:cNvPicPr/>
                   </pic:nvPicPr>
                   <pic:blipFill>
-                    <a:blip r:embed="rId7"/>
+                    <a:blip r:embed="rId17"/>
                     <a:stretch>
                       <a:fillRect/>
                     </a:stretch>
@@ -219,7 +638,7 @@
                     <pic:cNvPicPr/>
                   </pic:nvPicPr>
                   <pic:blipFill>
-                    <a:blip r:embed="rId8"/>
+                    <a:blip r:embed="rId18"/>
                     <a:stretch>
                       <a:fillRect/>
                     </a:stretch>
@@ -239,8 +658,6 @@
           </wp:inline>
         </w:drawing>
       </w:r>
-      <w:bookmarkStart w:id="0" w:name="_GoBack"/>
-      <w:bookmarkEnd w:id="0"/>
     </w:p>
     <w:sectPr>
       <w:pgSz w:w="12240" w:h="15840"/>

</xml_diff>